<commit_message>
Cycle 6: sort/filter, CSV export, DOCX slurry section, report wrapper fix
- Results tables: numeric-aware sorting (_NumericItem), right-click context
  menu with "Show only violations" filter and "Export to CSV" action
- DOCX report: dedicated Section 2A for non-Newtonian slurry analysis with
  parameters table, per-pipe headloss comparison, regime, and Re_B
- Fix report dialog passing raw results without steady_state wrapper — was
  silently skipping entire steady-state section in generated reports
- 11 new tests (sort, filter, CSV, DOCX slurry section)
- 1168 tests pass, 50/50 interactive driver

Co-Authored-By: Claude Opus 4.6 (1M context) <noreply@anthropic.com>
</commit_message>
<xml_diff>
--- a/output/driver_test.docx
+++ b/output/driver_test.docx
@@ -99,14 +99,189 @@
       <w:r>
         <w:rPr>
           <w:b/>
-          <w:color w:val="008000"/>
+          <w:color w:val="CC7A00"/>
         </w:rPr>
-        <w:t xml:space="preserve">PASS — </w:t>
+        <w:t xml:space="preserve">3 WARNING(s) — </w:t>
       </w:r>
       <w:r>
-        <w:t>All parameters are within WSAA guideline limits. The network meets minimum service pressure (20 m), maximum pressure (50 m), and velocity (&lt;2.0 m/s) requirements.</w:t>
+        <w:t>Items requiring review and remediation.</w:t>
       </w:r>
     </w:p>
+    <w:p>
+      <w:r>
+        <w:t>7 informational item(s) noted (e.g., low velocity warnings).</w:t>
+      </w:r>
+    </w:p>
+    <w:p>
+      <w:pPr>
+        <w:pStyle w:val="Heading2"/>
+      </w:pPr>
+      <w:r>
+        <w:t>Key Hydraulic Metrics</w:t>
+      </w:r>
+    </w:p>
+    <w:tbl>
+      <w:tblPr>
+        <w:tblStyle w:val="LightGrid-Accent1"/>
+        <w:tblW w:type="auto" w:w="0"/>
+        <w:jc w:val="center"/>
+        <w:tblLook w:firstColumn="1" w:firstRow="1" w:lastColumn="0" w:lastRow="0" w:noHBand="0" w:noVBand="1" w:val="04A0"/>
+      </w:tblPr>
+      <w:tblGrid>
+        <w:gridCol w:w="4320"/>
+        <w:gridCol w:w="4320"/>
+      </w:tblGrid>
+      <w:tr>
+        <w:tc>
+          <w:tcPr>
+            <w:tcW w:type="dxa" w:w="4320"/>
+            <w:shd w:fill="2E4057" w:val="clear"/>
+          </w:tcPr>
+          <w:p>
+            <w:pPr>
+              <w:jc w:val="center"/>
+            </w:pPr>
+            <w:r>
+              <w:rPr>
+                <w:b/>
+                <w:color w:val="FFFFFF"/>
+              </w:rPr>
+              <w:t>Metric</w:t>
+            </w:r>
+          </w:p>
+        </w:tc>
+        <w:tc>
+          <w:tcPr>
+            <w:tcW w:type="dxa" w:w="4320"/>
+            <w:shd w:fill="2E4057" w:val="clear"/>
+          </w:tcPr>
+          <w:p>
+            <w:pPr>
+              <w:jc w:val="center"/>
+            </w:pPr>
+            <w:r>
+              <w:rPr>
+                <w:b/>
+                <w:color w:val="FFFFFF"/>
+              </w:rPr>
+              <w:t>Value</w:t>
+            </w:r>
+          </w:p>
+        </w:tc>
+      </w:tr>
+      <w:tr>
+        <w:tc>
+          <w:tcPr>
+            <w:tcW w:type="dxa" w:w="4320"/>
+          </w:tcPr>
+          <w:p>
+            <w:pPr>
+              <w:jc w:val="center"/>
+            </w:pPr>
+            <w:r>
+              <w:t>Pressure Range</w:t>
+            </w:r>
+          </w:p>
+        </w:tc>
+        <w:tc>
+          <w:tcPr>
+            <w:tcW w:type="dxa" w:w="4320"/>
+          </w:tcPr>
+          <w:p>
+            <w:pPr>
+              <w:jc w:val="center"/>
+            </w:pPr>
+            <w:r>
+              <w:t>11.2 – 44.6 m</w:t>
+            </w:r>
+          </w:p>
+        </w:tc>
+      </w:tr>
+      <w:tr>
+        <w:tc>
+          <w:tcPr>
+            <w:tcW w:type="dxa" w:w="4320"/>
+          </w:tcPr>
+          <w:p>
+            <w:pPr>
+              <w:jc w:val="center"/>
+            </w:pPr>
+            <w:r>
+              <w:t>WSAA Min (20 m)</w:t>
+            </w:r>
+          </w:p>
+        </w:tc>
+        <w:tc>
+          <w:tcPr>
+            <w:tcW w:type="dxa" w:w="4320"/>
+          </w:tcPr>
+          <w:p>
+            <w:pPr>
+              <w:jc w:val="center"/>
+            </w:pPr>
+            <w:r>
+              <w:t>FAIL</w:t>
+            </w:r>
+          </w:p>
+        </w:tc>
+      </w:tr>
+      <w:tr>
+        <w:tc>
+          <w:tcPr>
+            <w:tcW w:type="dxa" w:w="4320"/>
+          </w:tcPr>
+          <w:p>
+            <w:pPr>
+              <w:jc w:val="center"/>
+            </w:pPr>
+            <w:r>
+              <w:t>WSAA Max (50 m)</w:t>
+            </w:r>
+          </w:p>
+        </w:tc>
+        <w:tc>
+          <w:tcPr>
+            <w:tcW w:type="dxa" w:w="4320"/>
+          </w:tcPr>
+          <w:p>
+            <w:pPr>
+              <w:jc w:val="center"/>
+            </w:pPr>
+            <w:r>
+              <w:t>PASS</w:t>
+            </w:r>
+          </w:p>
+        </w:tc>
+      </w:tr>
+      <w:tr>
+        <w:tc>
+          <w:tcPr>
+            <w:tcW w:type="dxa" w:w="4320"/>
+          </w:tcPr>
+          <w:p>
+            <w:pPr>
+              <w:jc w:val="center"/>
+            </w:pPr>
+            <w:r>
+              <w:t>Max Velocity</w:t>
+            </w:r>
+          </w:p>
+        </w:tc>
+        <w:tc>
+          <w:tcPr>
+            <w:tcW w:type="dxa" w:w="4320"/>
+          </w:tcPr>
+          <w:p>
+            <w:pPr>
+              <w:jc w:val="center"/>
+            </w:pPr>
+            <w:r>
+              <w:t>2.29 m/s (FAIL — limit 2.0 m/s)</w:t>
+            </w:r>
+          </w:p>
+        </w:tc>
+      </w:tr>
+    </w:tbl>
     <w:p>
       <w:pPr>
         <w:pStyle w:val="Heading2"/>
@@ -116,8 +291,19 @@
       </w:r>
     </w:p>
     <w:p>
+      <w:pPr>
+        <w:pStyle w:val="ListBullet"/>
+      </w:pPr>
       <w:r>
-        <w:t>No immediate actions required. Continue routine monitoring.</w:t>
+        <w:t>Investigate low pressure at J9, J10. Consider booster pump station or supply augmentation.</w:t>
+      </w:r>
+    </w:p>
+    <w:p>
+      <w:pPr>
+        <w:pStyle w:val="ListBullet"/>
+      </w:pPr>
+      <w:r>
+        <w:t>Review pipe sizing for P10 — velocity exceeds WSAA 2.0 m/s limit. Consider upsizing or parallel main.</w:t>
       </w:r>
     </w:p>
     <w:p>
@@ -397,12 +583,2048 @@
         <w:pStyle w:val="Heading1"/>
       </w:pPr>
       <w:r>
+        <w:t>2. Steady-State Results</w:t>
+      </w:r>
+    </w:p>
+    <w:p>
+      <w:pPr>
+        <w:pStyle w:val="Heading2"/>
+      </w:pPr>
+      <w:r>
+        <w:t>2.1 Junction Pressures</w:t>
+      </w:r>
+    </w:p>
+    <w:tbl>
+      <w:tblPr>
+        <w:tblStyle w:val="LightGrid-Accent1"/>
+        <w:tblW w:type="auto" w:w="0"/>
+        <w:jc w:val="center"/>
+        <w:tblLook w:firstColumn="1" w:firstRow="1" w:lastColumn="0" w:lastRow="0" w:noHBand="0" w:noVBand="1" w:val="04A0"/>
+      </w:tblPr>
+      <w:tblGrid>
+        <w:gridCol w:w="2160"/>
+        <w:gridCol w:w="2160"/>
+        <w:gridCol w:w="2160"/>
+        <w:gridCol w:w="2160"/>
+      </w:tblGrid>
+      <w:tr>
+        <w:tc>
+          <w:tcPr>
+            <w:tcW w:type="dxa" w:w="2160"/>
+            <w:shd w:fill="2E4057" w:val="clear"/>
+          </w:tcPr>
+          <w:p>
+            <w:pPr>
+              <w:jc w:val="center"/>
+            </w:pPr>
+            <w:r>
+              <w:rPr>
+                <w:b/>
+                <w:color w:val="FFFFFF"/>
+              </w:rPr>
+              <w:t>Junction</w:t>
+            </w:r>
+          </w:p>
+        </w:tc>
+        <w:tc>
+          <w:tcPr>
+            <w:tcW w:type="dxa" w:w="2160"/>
+            <w:shd w:fill="2E4057" w:val="clear"/>
+          </w:tcPr>
+          <w:p>
+            <w:pPr>
+              <w:jc w:val="center"/>
+            </w:pPr>
+            <w:r>
+              <w:rPr>
+                <w:b/>
+                <w:color w:val="FFFFFF"/>
+              </w:rPr>
+              <w:t>Min (m)</w:t>
+            </w:r>
+          </w:p>
+        </w:tc>
+        <w:tc>
+          <w:tcPr>
+            <w:tcW w:type="dxa" w:w="2160"/>
+            <w:shd w:fill="2E4057" w:val="clear"/>
+          </w:tcPr>
+          <w:p>
+            <w:pPr>
+              <w:jc w:val="center"/>
+            </w:pPr>
+            <w:r>
+              <w:rPr>
+                <w:b/>
+                <w:color w:val="FFFFFF"/>
+              </w:rPr>
+              <w:t>Max (m)</w:t>
+            </w:r>
+          </w:p>
+        </w:tc>
+        <w:tc>
+          <w:tcPr>
+            <w:tcW w:type="dxa" w:w="2160"/>
+            <w:shd w:fill="2E4057" w:val="clear"/>
+          </w:tcPr>
+          <w:p>
+            <w:pPr>
+              <w:jc w:val="center"/>
+            </w:pPr>
+            <w:r>
+              <w:rPr>
+                <w:b/>
+                <w:color w:val="FFFFFF"/>
+              </w:rPr>
+              <w:t>Avg (m)</w:t>
+            </w:r>
+          </w:p>
+        </w:tc>
+      </w:tr>
+      <w:tr>
+        <w:tc>
+          <w:tcPr>
+            <w:tcW w:type="dxa" w:w="2160"/>
+          </w:tcPr>
+          <w:p>
+            <w:pPr>
+              <w:jc w:val="center"/>
+            </w:pPr>
+            <w:r>
+              <w:t>J1</w:t>
+            </w:r>
+          </w:p>
+        </w:tc>
+        <w:tc>
+          <w:tcPr>
+            <w:tcW w:type="dxa" w:w="2160"/>
+          </w:tcPr>
+          <w:p>
+            <w:pPr>
+              <w:jc w:val="center"/>
+            </w:pPr>
+            <w:r>
+              <w:t>44.6</w:t>
+            </w:r>
+          </w:p>
+        </w:tc>
+        <w:tc>
+          <w:tcPr>
+            <w:tcW w:type="dxa" w:w="2160"/>
+          </w:tcPr>
+          <w:p>
+            <w:pPr>
+              <w:jc w:val="center"/>
+            </w:pPr>
+            <w:r>
+              <w:t>44.6</w:t>
+            </w:r>
+          </w:p>
+        </w:tc>
+        <w:tc>
+          <w:tcPr>
+            <w:tcW w:type="dxa" w:w="2160"/>
+          </w:tcPr>
+          <w:p>
+            <w:pPr>
+              <w:jc w:val="center"/>
+            </w:pPr>
+            <w:r>
+              <w:t>44.6</w:t>
+            </w:r>
+          </w:p>
+        </w:tc>
+      </w:tr>
+      <w:tr>
+        <w:tc>
+          <w:tcPr>
+            <w:tcW w:type="dxa" w:w="2160"/>
+          </w:tcPr>
+          <w:p>
+            <w:pPr>
+              <w:jc w:val="center"/>
+            </w:pPr>
+            <w:r>
+              <w:t>J2</w:t>
+            </w:r>
+          </w:p>
+        </w:tc>
+        <w:tc>
+          <w:tcPr>
+            <w:tcW w:type="dxa" w:w="2160"/>
+          </w:tcPr>
+          <w:p>
+            <w:pPr>
+              <w:jc w:val="center"/>
+            </w:pPr>
+            <w:r>
+              <w:t>41.1</w:t>
+            </w:r>
+          </w:p>
+        </w:tc>
+        <w:tc>
+          <w:tcPr>
+            <w:tcW w:type="dxa" w:w="2160"/>
+          </w:tcPr>
+          <w:p>
+            <w:pPr>
+              <w:jc w:val="center"/>
+            </w:pPr>
+            <w:r>
+              <w:t>41.1</w:t>
+            </w:r>
+          </w:p>
+        </w:tc>
+        <w:tc>
+          <w:tcPr>
+            <w:tcW w:type="dxa" w:w="2160"/>
+          </w:tcPr>
+          <w:p>
+            <w:pPr>
+              <w:jc w:val="center"/>
+            </w:pPr>
+            <w:r>
+              <w:t>41.1</w:t>
+            </w:r>
+          </w:p>
+        </w:tc>
+      </w:tr>
+      <w:tr>
+        <w:tc>
+          <w:tcPr>
+            <w:tcW w:type="dxa" w:w="2160"/>
+          </w:tcPr>
+          <w:p>
+            <w:pPr>
+              <w:jc w:val="center"/>
+            </w:pPr>
+            <w:r>
+              <w:t>J3</w:t>
+            </w:r>
+          </w:p>
+        </w:tc>
+        <w:tc>
+          <w:tcPr>
+            <w:tcW w:type="dxa" w:w="2160"/>
+          </w:tcPr>
+          <w:p>
+            <w:pPr>
+              <w:jc w:val="center"/>
+            </w:pPr>
+            <w:r>
+              <w:t>38.8</w:t>
+            </w:r>
+          </w:p>
+        </w:tc>
+        <w:tc>
+          <w:tcPr>
+            <w:tcW w:type="dxa" w:w="2160"/>
+          </w:tcPr>
+          <w:p>
+            <w:pPr>
+              <w:jc w:val="center"/>
+            </w:pPr>
+            <w:r>
+              <w:t>38.8</w:t>
+            </w:r>
+          </w:p>
+        </w:tc>
+        <w:tc>
+          <w:tcPr>
+            <w:tcW w:type="dxa" w:w="2160"/>
+          </w:tcPr>
+          <w:p>
+            <w:pPr>
+              <w:jc w:val="center"/>
+            </w:pPr>
+            <w:r>
+              <w:t>38.8</w:t>
+            </w:r>
+          </w:p>
+        </w:tc>
+      </w:tr>
+      <w:tr>
+        <w:tc>
+          <w:tcPr>
+            <w:tcW w:type="dxa" w:w="2160"/>
+          </w:tcPr>
+          <w:p>
+            <w:pPr>
+              <w:jc w:val="center"/>
+            </w:pPr>
+            <w:r>
+              <w:t>J4</w:t>
+            </w:r>
+          </w:p>
+        </w:tc>
+        <w:tc>
+          <w:tcPr>
+            <w:tcW w:type="dxa" w:w="2160"/>
+          </w:tcPr>
+          <w:p>
+            <w:pPr>
+              <w:jc w:val="center"/>
+            </w:pPr>
+            <w:r>
+              <w:t>33.7</w:t>
+            </w:r>
+          </w:p>
+        </w:tc>
+        <w:tc>
+          <w:tcPr>
+            <w:tcW w:type="dxa" w:w="2160"/>
+          </w:tcPr>
+          <w:p>
+            <w:pPr>
+              <w:jc w:val="center"/>
+            </w:pPr>
+            <w:r>
+              <w:t>33.7</w:t>
+            </w:r>
+          </w:p>
+        </w:tc>
+        <w:tc>
+          <w:tcPr>
+            <w:tcW w:type="dxa" w:w="2160"/>
+          </w:tcPr>
+          <w:p>
+            <w:pPr>
+              <w:jc w:val="center"/>
+            </w:pPr>
+            <w:r>
+              <w:t>33.7</w:t>
+            </w:r>
+          </w:p>
+        </w:tc>
+      </w:tr>
+      <w:tr>
+        <w:tc>
+          <w:tcPr>
+            <w:tcW w:type="dxa" w:w="2160"/>
+          </w:tcPr>
+          <w:p>
+            <w:pPr>
+              <w:jc w:val="center"/>
+            </w:pPr>
+            <w:r>
+              <w:t>J5</w:t>
+            </w:r>
+          </w:p>
+        </w:tc>
+        <w:tc>
+          <w:tcPr>
+            <w:tcW w:type="dxa" w:w="2160"/>
+          </w:tcPr>
+          <w:p>
+            <w:pPr>
+              <w:jc w:val="center"/>
+            </w:pPr>
+            <w:r>
+              <w:t>28.6</w:t>
+            </w:r>
+          </w:p>
+        </w:tc>
+        <w:tc>
+          <w:tcPr>
+            <w:tcW w:type="dxa" w:w="2160"/>
+          </w:tcPr>
+          <w:p>
+            <w:pPr>
+              <w:jc w:val="center"/>
+            </w:pPr>
+            <w:r>
+              <w:t>28.6</w:t>
+            </w:r>
+          </w:p>
+        </w:tc>
+        <w:tc>
+          <w:tcPr>
+            <w:tcW w:type="dxa" w:w="2160"/>
+          </w:tcPr>
+          <w:p>
+            <w:pPr>
+              <w:jc w:val="center"/>
+            </w:pPr>
+            <w:r>
+              <w:t>28.6</w:t>
+            </w:r>
+          </w:p>
+        </w:tc>
+      </w:tr>
+      <w:tr>
+        <w:tc>
+          <w:tcPr>
+            <w:tcW w:type="dxa" w:w="2160"/>
+          </w:tcPr>
+          <w:p>
+            <w:pPr>
+              <w:jc w:val="center"/>
+            </w:pPr>
+            <w:r>
+              <w:t>J6</w:t>
+            </w:r>
+          </w:p>
+        </w:tc>
+        <w:tc>
+          <w:tcPr>
+            <w:tcW w:type="dxa" w:w="2160"/>
+          </w:tcPr>
+          <w:p>
+            <w:pPr>
+              <w:jc w:val="center"/>
+            </w:pPr>
+            <w:r>
+              <w:t>30.7</w:t>
+            </w:r>
+          </w:p>
+        </w:tc>
+        <w:tc>
+          <w:tcPr>
+            <w:tcW w:type="dxa" w:w="2160"/>
+          </w:tcPr>
+          <w:p>
+            <w:pPr>
+              <w:jc w:val="center"/>
+            </w:pPr>
+            <w:r>
+              <w:t>30.7</w:t>
+            </w:r>
+          </w:p>
+        </w:tc>
+        <w:tc>
+          <w:tcPr>
+            <w:tcW w:type="dxa" w:w="2160"/>
+          </w:tcPr>
+          <w:p>
+            <w:pPr>
+              <w:jc w:val="center"/>
+            </w:pPr>
+            <w:r>
+              <w:t>30.7</w:t>
+            </w:r>
+          </w:p>
+        </w:tc>
+      </w:tr>
+      <w:tr>
+        <w:tc>
+          <w:tcPr>
+            <w:tcW w:type="dxa" w:w="2160"/>
+          </w:tcPr>
+          <w:p>
+            <w:pPr>
+              <w:jc w:val="center"/>
+            </w:pPr>
+            <w:r>
+              <w:t>J7</w:t>
+            </w:r>
+          </w:p>
+        </w:tc>
+        <w:tc>
+          <w:tcPr>
+            <w:tcW w:type="dxa" w:w="2160"/>
+          </w:tcPr>
+          <w:p>
+            <w:pPr>
+              <w:jc w:val="center"/>
+            </w:pPr>
+            <w:r>
+              <w:t>37.0</w:t>
+            </w:r>
+          </w:p>
+        </w:tc>
+        <w:tc>
+          <w:tcPr>
+            <w:tcW w:type="dxa" w:w="2160"/>
+          </w:tcPr>
+          <w:p>
+            <w:pPr>
+              <w:jc w:val="center"/>
+            </w:pPr>
+            <w:r>
+              <w:t>37.0</w:t>
+            </w:r>
+          </w:p>
+        </w:tc>
+        <w:tc>
+          <w:tcPr>
+            <w:tcW w:type="dxa" w:w="2160"/>
+          </w:tcPr>
+          <w:p>
+            <w:pPr>
+              <w:jc w:val="center"/>
+            </w:pPr>
+            <w:r>
+              <w:t>37.0</w:t>
+            </w:r>
+          </w:p>
+        </w:tc>
+      </w:tr>
+      <w:tr>
+        <w:tc>
+          <w:tcPr>
+            <w:tcW w:type="dxa" w:w="2160"/>
+          </w:tcPr>
+          <w:p>
+            <w:pPr>
+              <w:jc w:val="center"/>
+            </w:pPr>
+            <w:r>
+              <w:t>J8</w:t>
+            </w:r>
+          </w:p>
+        </w:tc>
+        <w:tc>
+          <w:tcPr>
+            <w:tcW w:type="dxa" w:w="2160"/>
+          </w:tcPr>
+          <w:p>
+            <w:pPr>
+              <w:jc w:val="center"/>
+            </w:pPr>
+            <w:r>
+              <w:t>43.2</w:t>
+            </w:r>
+          </w:p>
+        </w:tc>
+        <w:tc>
+          <w:tcPr>
+            <w:tcW w:type="dxa" w:w="2160"/>
+          </w:tcPr>
+          <w:p>
+            <w:pPr>
+              <w:jc w:val="center"/>
+            </w:pPr>
+            <w:r>
+              <w:t>43.2</w:t>
+            </w:r>
+          </w:p>
+        </w:tc>
+        <w:tc>
+          <w:tcPr>
+            <w:tcW w:type="dxa" w:w="2160"/>
+          </w:tcPr>
+          <w:p>
+            <w:pPr>
+              <w:jc w:val="center"/>
+            </w:pPr>
+            <w:r>
+              <w:t>43.2</w:t>
+            </w:r>
+          </w:p>
+        </w:tc>
+      </w:tr>
+      <w:tr>
+        <w:tc>
+          <w:tcPr>
+            <w:tcW w:type="dxa" w:w="2160"/>
+          </w:tcPr>
+          <w:p>
+            <w:pPr>
+              <w:jc w:val="center"/>
+            </w:pPr>
+            <w:r>
+              <w:t>J9</w:t>
+            </w:r>
+          </w:p>
+        </w:tc>
+        <w:tc>
+          <w:tcPr>
+            <w:tcW w:type="dxa" w:w="2160"/>
+          </w:tcPr>
+          <w:p>
+            <w:pPr>
+              <w:jc w:val="center"/>
+            </w:pPr>
+            <w:r>
+              <w:t>16.1</w:t>
+            </w:r>
+          </w:p>
+        </w:tc>
+        <w:tc>
+          <w:tcPr>
+            <w:tcW w:type="dxa" w:w="2160"/>
+          </w:tcPr>
+          <w:p>
+            <w:pPr>
+              <w:jc w:val="center"/>
+            </w:pPr>
+            <w:r>
+              <w:t>16.1</w:t>
+            </w:r>
+          </w:p>
+        </w:tc>
+        <w:tc>
+          <w:tcPr>
+            <w:tcW w:type="dxa" w:w="2160"/>
+          </w:tcPr>
+          <w:p>
+            <w:pPr>
+              <w:jc w:val="center"/>
+            </w:pPr>
+            <w:r>
+              <w:t>16.1</w:t>
+            </w:r>
+          </w:p>
+        </w:tc>
+      </w:tr>
+      <w:tr>
+        <w:tc>
+          <w:tcPr>
+            <w:tcW w:type="dxa" w:w="2160"/>
+          </w:tcPr>
+          <w:p>
+            <w:pPr>
+              <w:jc w:val="center"/>
+            </w:pPr>
+            <w:r>
+              <w:t>J10</w:t>
+            </w:r>
+          </w:p>
+        </w:tc>
+        <w:tc>
+          <w:tcPr>
+            <w:tcW w:type="dxa" w:w="2160"/>
+          </w:tcPr>
+          <w:p>
+            <w:pPr>
+              <w:jc w:val="center"/>
+            </w:pPr>
+            <w:r>
+              <w:t>11.2</w:t>
+            </w:r>
+          </w:p>
+        </w:tc>
+        <w:tc>
+          <w:tcPr>
+            <w:tcW w:type="dxa" w:w="2160"/>
+          </w:tcPr>
+          <w:p>
+            <w:pPr>
+              <w:jc w:val="center"/>
+            </w:pPr>
+            <w:r>
+              <w:t>11.2</w:t>
+            </w:r>
+          </w:p>
+        </w:tc>
+        <w:tc>
+          <w:tcPr>
+            <w:tcW w:type="dxa" w:w="2160"/>
+          </w:tcPr>
+          <w:p>
+            <w:pPr>
+              <w:jc w:val="center"/>
+            </w:pPr>
+            <w:r>
+              <w:t>11.2</w:t>
+            </w:r>
+          </w:p>
+        </w:tc>
+      </w:tr>
+    </w:tbl>
+    <w:p>
+      <w:pPr>
+        <w:pStyle w:val="Heading2"/>
+      </w:pPr>
+      <w:r>
+        <w:t>2.2 Pipe Flows</w:t>
+      </w:r>
+    </w:p>
+    <w:tbl>
+      <w:tblPr>
+        <w:tblStyle w:val="LightGrid-Accent1"/>
+        <w:tblW w:type="auto" w:w="0"/>
+        <w:jc w:val="center"/>
+        <w:tblLook w:firstColumn="1" w:firstRow="1" w:lastColumn="0" w:lastRow="0" w:noHBand="0" w:noVBand="1" w:val="04A0"/>
+      </w:tblPr>
+      <w:tblGrid>
+        <w:gridCol w:w="1728"/>
+        <w:gridCol w:w="1728"/>
+        <w:gridCol w:w="1728"/>
+        <w:gridCol w:w="1728"/>
+        <w:gridCol w:w="1728"/>
+      </w:tblGrid>
+      <w:tr>
+        <w:tc>
+          <w:tcPr>
+            <w:tcW w:type="dxa" w:w="1728"/>
+            <w:shd w:fill="2E4057" w:val="clear"/>
+          </w:tcPr>
+          <w:p>
+            <w:pPr>
+              <w:jc w:val="center"/>
+            </w:pPr>
+            <w:r>
+              <w:rPr>
+                <w:b/>
+                <w:color w:val="FFFFFF"/>
+              </w:rPr>
+              <w:t>Pipe</w:t>
+            </w:r>
+          </w:p>
+        </w:tc>
+        <w:tc>
+          <w:tcPr>
+            <w:tcW w:type="dxa" w:w="1728"/>
+            <w:shd w:fill="2E4057" w:val="clear"/>
+          </w:tcPr>
+          <w:p>
+            <w:pPr>
+              <w:jc w:val="center"/>
+            </w:pPr>
+            <w:r>
+              <w:rPr>
+                <w:b/>
+                <w:color w:val="FFFFFF"/>
+              </w:rPr>
+              <w:t>Min (LPS)</w:t>
+            </w:r>
+          </w:p>
+        </w:tc>
+        <w:tc>
+          <w:tcPr>
+            <w:tcW w:type="dxa" w:w="1728"/>
+            <w:shd w:fill="2E4057" w:val="clear"/>
+          </w:tcPr>
+          <w:p>
+            <w:pPr>
+              <w:jc w:val="center"/>
+            </w:pPr>
+            <w:r>
+              <w:rPr>
+                <w:b/>
+                <w:color w:val="FFFFFF"/>
+              </w:rPr>
+              <w:t>Max (LPS)</w:t>
+            </w:r>
+          </w:p>
+        </w:tc>
+        <w:tc>
+          <w:tcPr>
+            <w:tcW w:type="dxa" w:w="1728"/>
+            <w:shd w:fill="2E4057" w:val="clear"/>
+          </w:tcPr>
+          <w:p>
+            <w:pPr>
+              <w:jc w:val="center"/>
+            </w:pPr>
+            <w:r>
+              <w:rPr>
+                <w:b/>
+                <w:color w:val="FFFFFF"/>
+              </w:rPr>
+              <w:t>Avg (LPS)</w:t>
+            </w:r>
+          </w:p>
+        </w:tc>
+        <w:tc>
+          <w:tcPr>
+            <w:tcW w:type="dxa" w:w="1728"/>
+            <w:shd w:fill="2E4057" w:val="clear"/>
+          </w:tcPr>
+          <w:p>
+            <w:pPr>
+              <w:jc w:val="center"/>
+            </w:pPr>
+            <w:r>
+              <w:rPr>
+                <w:b/>
+                <w:color w:val="FFFFFF"/>
+              </w:rPr>
+              <w:t>Velocity (m/s)</w:t>
+            </w:r>
+          </w:p>
+        </w:tc>
+      </w:tr>
+      <w:tr>
+        <w:tc>
+          <w:tcPr>
+            <w:tcW w:type="dxa" w:w="1728"/>
+          </w:tcPr>
+          <w:p>
+            <w:pPr>
+              <w:jc w:val="center"/>
+            </w:pPr>
+            <w:r>
+              <w:t>P1</w:t>
+            </w:r>
+          </w:p>
+        </w:tc>
+        <w:tc>
+          <w:tcPr>
+            <w:tcW w:type="dxa" w:w="1728"/>
+          </w:tcPr>
+          <w:p>
+            <w:pPr>
+              <w:jc w:val="center"/>
+            </w:pPr>
+            <w:r>
+              <w:t>55.0</w:t>
+            </w:r>
+          </w:p>
+        </w:tc>
+        <w:tc>
+          <w:tcPr>
+            <w:tcW w:type="dxa" w:w="1728"/>
+          </w:tcPr>
+          <w:p>
+            <w:pPr>
+              <w:jc w:val="center"/>
+            </w:pPr>
+            <w:r>
+              <w:t>55.0</w:t>
+            </w:r>
+          </w:p>
+        </w:tc>
+        <w:tc>
+          <w:tcPr>
+            <w:tcW w:type="dxa" w:w="1728"/>
+          </w:tcPr>
+          <w:p>
+            <w:pPr>
+              <w:jc w:val="center"/>
+            </w:pPr>
+            <w:r>
+              <w:t>55.0</w:t>
+            </w:r>
+          </w:p>
+        </w:tc>
+        <w:tc>
+          <w:tcPr>
+            <w:tcW w:type="dxa" w:w="1728"/>
+          </w:tcPr>
+          <w:p>
+            <w:pPr>
+              <w:jc w:val="center"/>
+            </w:pPr>
+            <w:r>
+              <w:t>0.78</w:t>
+            </w:r>
+          </w:p>
+        </w:tc>
+      </w:tr>
+      <w:tr>
+        <w:tc>
+          <w:tcPr>
+            <w:tcW w:type="dxa" w:w="1728"/>
+          </w:tcPr>
+          <w:p>
+            <w:pPr>
+              <w:jc w:val="center"/>
+            </w:pPr>
+            <w:r>
+              <w:t>P2</w:t>
+            </w:r>
+          </w:p>
+        </w:tc>
+        <w:tc>
+          <w:tcPr>
+            <w:tcW w:type="dxa" w:w="1728"/>
+          </w:tcPr>
+          <w:p>
+            <w:pPr>
+              <w:jc w:val="center"/>
+            </w:pPr>
+            <w:r>
+              <w:t>35.14</w:t>
+            </w:r>
+          </w:p>
+        </w:tc>
+        <w:tc>
+          <w:tcPr>
+            <w:tcW w:type="dxa" w:w="1728"/>
+          </w:tcPr>
+          <w:p>
+            <w:pPr>
+              <w:jc w:val="center"/>
+            </w:pPr>
+            <w:r>
+              <w:t>35.14</w:t>
+            </w:r>
+          </w:p>
+        </w:tc>
+        <w:tc>
+          <w:tcPr>
+            <w:tcW w:type="dxa" w:w="1728"/>
+          </w:tcPr>
+          <w:p>
+            <w:pPr>
+              <w:jc w:val="center"/>
+            </w:pPr>
+            <w:r>
+              <w:t>35.14</w:t>
+            </w:r>
+          </w:p>
+        </w:tc>
+        <w:tc>
+          <w:tcPr>
+            <w:tcW w:type="dxa" w:w="1728"/>
+          </w:tcPr>
+          <w:p>
+            <w:pPr>
+              <w:jc w:val="center"/>
+            </w:pPr>
+            <w:r>
+              <w:t>0.72</w:t>
+            </w:r>
+          </w:p>
+        </w:tc>
+      </w:tr>
+      <w:tr>
+        <w:tc>
+          <w:tcPr>
+            <w:tcW w:type="dxa" w:w="1728"/>
+          </w:tcPr>
+          <w:p>
+            <w:pPr>
+              <w:jc w:val="center"/>
+            </w:pPr>
+            <w:r>
+              <w:t>P3</w:t>
+            </w:r>
+          </w:p>
+        </w:tc>
+        <w:tc>
+          <w:tcPr>
+            <w:tcW w:type="dxa" w:w="1728"/>
+          </w:tcPr>
+          <w:p>
+            <w:pPr>
+              <w:jc w:val="center"/>
+            </w:pPr>
+            <w:r>
+              <w:t>31.14</w:t>
+            </w:r>
+          </w:p>
+        </w:tc>
+        <w:tc>
+          <w:tcPr>
+            <w:tcW w:type="dxa" w:w="1728"/>
+          </w:tcPr>
+          <w:p>
+            <w:pPr>
+              <w:jc w:val="center"/>
+            </w:pPr>
+            <w:r>
+              <w:t>31.14</w:t>
+            </w:r>
+          </w:p>
+        </w:tc>
+        <w:tc>
+          <w:tcPr>
+            <w:tcW w:type="dxa" w:w="1728"/>
+          </w:tcPr>
+          <w:p>
+            <w:pPr>
+              <w:jc w:val="center"/>
+            </w:pPr>
+            <w:r>
+              <w:t>31.14</w:t>
+            </w:r>
+          </w:p>
+        </w:tc>
+        <w:tc>
+          <w:tcPr>
+            <w:tcW w:type="dxa" w:w="1728"/>
+          </w:tcPr>
+          <w:p>
+            <w:pPr>
+              <w:jc w:val="center"/>
+            </w:pPr>
+            <w:r>
+              <w:t>0.63</w:t>
+            </w:r>
+          </w:p>
+        </w:tc>
+      </w:tr>
+      <w:tr>
+        <w:tc>
+          <w:tcPr>
+            <w:tcW w:type="dxa" w:w="1728"/>
+          </w:tcPr>
+          <w:p>
+            <w:pPr>
+              <w:jc w:val="center"/>
+            </w:pPr>
+            <w:r>
+              <w:t>P4</w:t>
+            </w:r>
+          </w:p>
+        </w:tc>
+        <w:tc>
+          <w:tcPr>
+            <w:tcW w:type="dxa" w:w="1728"/>
+          </w:tcPr>
+          <w:p>
+            <w:pPr>
+              <w:jc w:val="center"/>
+            </w:pPr>
+            <w:r>
+              <w:t>7.14</w:t>
+            </w:r>
+          </w:p>
+        </w:tc>
+        <w:tc>
+          <w:tcPr>
+            <w:tcW w:type="dxa" w:w="1728"/>
+          </w:tcPr>
+          <w:p>
+            <w:pPr>
+              <w:jc w:val="center"/>
+            </w:pPr>
+            <w:r>
+              <w:t>7.14</w:t>
+            </w:r>
+          </w:p>
+        </w:tc>
+        <w:tc>
+          <w:tcPr>
+            <w:tcW w:type="dxa" w:w="1728"/>
+          </w:tcPr>
+          <w:p>
+            <w:pPr>
+              <w:jc w:val="center"/>
+            </w:pPr>
+            <w:r>
+              <w:t>7.14</w:t>
+            </w:r>
+          </w:p>
+        </w:tc>
+        <w:tc>
+          <w:tcPr>
+            <w:tcW w:type="dxa" w:w="1728"/>
+          </w:tcPr>
+          <w:p>
+            <w:pPr>
+              <w:jc w:val="center"/>
+            </w:pPr>
+            <w:r>
+              <w:t>0.23</w:t>
+            </w:r>
+          </w:p>
+        </w:tc>
+      </w:tr>
+      <w:tr>
+        <w:tc>
+          <w:tcPr>
+            <w:tcW w:type="dxa" w:w="1728"/>
+          </w:tcPr>
+          <w:p>
+            <w:pPr>
+              <w:jc w:val="center"/>
+            </w:pPr>
+            <w:r>
+              <w:t>P5</w:t>
+            </w:r>
+          </w:p>
+        </w:tc>
+        <w:tc>
+          <w:tcPr>
+            <w:tcW w:type="dxa" w:w="1728"/>
+          </w:tcPr>
+          <w:p>
+            <w:pPr>
+              <w:jc w:val="center"/>
+            </w:pPr>
+            <w:r>
+              <w:t>4.14</w:t>
+            </w:r>
+          </w:p>
+        </w:tc>
+        <w:tc>
+          <w:tcPr>
+            <w:tcW w:type="dxa" w:w="1728"/>
+          </w:tcPr>
+          <w:p>
+            <w:pPr>
+              <w:jc w:val="center"/>
+            </w:pPr>
+            <w:r>
+              <w:t>4.14</w:t>
+            </w:r>
+          </w:p>
+        </w:tc>
+        <w:tc>
+          <w:tcPr>
+            <w:tcW w:type="dxa" w:w="1728"/>
+          </w:tcPr>
+          <w:p>
+            <w:pPr>
+              <w:jc w:val="center"/>
+            </w:pPr>
+            <w:r>
+              <w:t>4.14</w:t>
+            </w:r>
+          </w:p>
+        </w:tc>
+        <w:tc>
+          <w:tcPr>
+            <w:tcW w:type="dxa" w:w="1728"/>
+          </w:tcPr>
+          <w:p>
+            <w:pPr>
+              <w:jc w:val="center"/>
+            </w:pPr>
+            <w:r>
+              <w:t>0.23</w:t>
+            </w:r>
+          </w:p>
+        </w:tc>
+      </w:tr>
+      <w:tr>
+        <w:tc>
+          <w:tcPr>
+            <w:tcW w:type="dxa" w:w="1728"/>
+          </w:tcPr>
+          <w:p>
+            <w:pPr>
+              <w:jc w:val="center"/>
+            </w:pPr>
+            <w:r>
+              <w:t>P6</w:t>
+            </w:r>
+          </w:p>
+        </w:tc>
+        <w:tc>
+          <w:tcPr>
+            <w:tcW w:type="dxa" w:w="1728"/>
+          </w:tcPr>
+          <w:p>
+            <w:pPr>
+              <w:jc w:val="center"/>
+            </w:pPr>
+            <w:r>
+              <w:t>-3.86</w:t>
+            </w:r>
+          </w:p>
+        </w:tc>
+        <w:tc>
+          <w:tcPr>
+            <w:tcW w:type="dxa" w:w="1728"/>
+          </w:tcPr>
+          <w:p>
+            <w:pPr>
+              <w:jc w:val="center"/>
+            </w:pPr>
+            <w:r>
+              <w:t>-3.86</w:t>
+            </w:r>
+          </w:p>
+        </w:tc>
+        <w:tc>
+          <w:tcPr>
+            <w:tcW w:type="dxa" w:w="1728"/>
+          </w:tcPr>
+          <w:p>
+            <w:pPr>
+              <w:jc w:val="center"/>
+            </w:pPr>
+            <w:r>
+              <w:t>-3.86</w:t>
+            </w:r>
+          </w:p>
+        </w:tc>
+        <w:tc>
+          <w:tcPr>
+            <w:tcW w:type="dxa" w:w="1728"/>
+          </w:tcPr>
+          <w:p>
+            <w:pPr>
+              <w:jc w:val="center"/>
+            </w:pPr>
+            <w:r>
+              <w:t>0.22</w:t>
+            </w:r>
+          </w:p>
+        </w:tc>
+      </w:tr>
+      <w:tr>
+        <w:tc>
+          <w:tcPr>
+            <w:tcW w:type="dxa" w:w="1728"/>
+          </w:tcPr>
+          <w:p>
+            <w:pPr>
+              <w:jc w:val="center"/>
+            </w:pPr>
+            <w:r>
+              <w:t>P7</w:t>
+            </w:r>
+          </w:p>
+        </w:tc>
+        <w:tc>
+          <w:tcPr>
+            <w:tcW w:type="dxa" w:w="1728"/>
+          </w:tcPr>
+          <w:p>
+            <w:pPr>
+              <w:jc w:val="center"/>
+            </w:pPr>
+            <w:r>
+              <w:t>-6.86</w:t>
+            </w:r>
+          </w:p>
+        </w:tc>
+        <w:tc>
+          <w:tcPr>
+            <w:tcW w:type="dxa" w:w="1728"/>
+          </w:tcPr>
+          <w:p>
+            <w:pPr>
+              <w:jc w:val="center"/>
+            </w:pPr>
+            <w:r>
+              <w:t>-6.86</w:t>
+            </w:r>
+          </w:p>
+        </w:tc>
+        <w:tc>
+          <w:tcPr>
+            <w:tcW w:type="dxa" w:w="1728"/>
+          </w:tcPr>
+          <w:p>
+            <w:pPr>
+              <w:jc w:val="center"/>
+            </w:pPr>
+            <w:r>
+              <w:t>-6.86</w:t>
+            </w:r>
+          </w:p>
+        </w:tc>
+        <w:tc>
+          <w:tcPr>
+            <w:tcW w:type="dxa" w:w="1728"/>
+          </w:tcPr>
+          <w:p>
+            <w:pPr>
+              <w:jc w:val="center"/>
+            </w:pPr>
+            <w:r>
+              <w:t>0.39</w:t>
+            </w:r>
+          </w:p>
+        </w:tc>
+      </w:tr>
+      <w:tr>
+        <w:tc>
+          <w:tcPr>
+            <w:tcW w:type="dxa" w:w="1728"/>
+          </w:tcPr>
+          <w:p>
+            <w:pPr>
+              <w:jc w:val="center"/>
+            </w:pPr>
+            <w:r>
+              <w:t>P8</w:t>
+            </w:r>
+          </w:p>
+        </w:tc>
+        <w:tc>
+          <w:tcPr>
+            <w:tcW w:type="dxa" w:w="1728"/>
+          </w:tcPr>
+          <w:p>
+            <w:pPr>
+              <w:jc w:val="center"/>
+            </w:pPr>
+            <w:r>
+              <w:t>-11.86</w:t>
+            </w:r>
+          </w:p>
+        </w:tc>
+        <w:tc>
+          <w:tcPr>
+            <w:tcW w:type="dxa" w:w="1728"/>
+          </w:tcPr>
+          <w:p>
+            <w:pPr>
+              <w:jc w:val="center"/>
+            </w:pPr>
+            <w:r>
+              <w:t>-11.86</w:t>
+            </w:r>
+          </w:p>
+        </w:tc>
+        <w:tc>
+          <w:tcPr>
+            <w:tcW w:type="dxa" w:w="1728"/>
+          </w:tcPr>
+          <w:p>
+            <w:pPr>
+              <w:jc w:val="center"/>
+            </w:pPr>
+            <w:r>
+              <w:t>-11.86</w:t>
+            </w:r>
+          </w:p>
+        </w:tc>
+        <w:tc>
+          <w:tcPr>
+            <w:tcW w:type="dxa" w:w="1728"/>
+          </w:tcPr>
+          <w:p>
+            <w:pPr>
+              <w:jc w:val="center"/>
+            </w:pPr>
+            <w:r>
+              <w:t>0.38</w:t>
+            </w:r>
+          </w:p>
+        </w:tc>
+      </w:tr>
+      <w:tr>
+        <w:tc>
+          <w:tcPr>
+            <w:tcW w:type="dxa" w:w="1728"/>
+          </w:tcPr>
+          <w:p>
+            <w:pPr>
+              <w:jc w:val="center"/>
+            </w:pPr>
+            <w:r>
+              <w:t>P9</w:t>
+            </w:r>
+          </w:p>
+        </w:tc>
+        <w:tc>
+          <w:tcPr>
+            <w:tcW w:type="dxa" w:w="1728"/>
+          </w:tcPr>
+          <w:p>
+            <w:pPr>
+              <w:jc w:val="center"/>
+            </w:pPr>
+            <w:r>
+              <w:t>-14.86</w:t>
+            </w:r>
+          </w:p>
+        </w:tc>
+        <w:tc>
+          <w:tcPr>
+            <w:tcW w:type="dxa" w:w="1728"/>
+          </w:tcPr>
+          <w:p>
+            <w:pPr>
+              <w:jc w:val="center"/>
+            </w:pPr>
+            <w:r>
+              <w:t>-14.86</w:t>
+            </w:r>
+          </w:p>
+        </w:tc>
+        <w:tc>
+          <w:tcPr>
+            <w:tcW w:type="dxa" w:w="1728"/>
+          </w:tcPr>
+          <w:p>
+            <w:pPr>
+              <w:jc w:val="center"/>
+            </w:pPr>
+            <w:r>
+              <w:t>-14.86</w:t>
+            </w:r>
+          </w:p>
+        </w:tc>
+        <w:tc>
+          <w:tcPr>
+            <w:tcW w:type="dxa" w:w="1728"/>
+          </w:tcPr>
+          <w:p>
+            <w:pPr>
+              <w:jc w:val="center"/>
+            </w:pPr>
+            <w:r>
+              <w:t>0.47</w:t>
+            </w:r>
+          </w:p>
+        </w:tc>
+      </w:tr>
+      <w:tr>
+        <w:tc>
+          <w:tcPr>
+            <w:tcW w:type="dxa" w:w="1728"/>
+          </w:tcPr>
+          <w:p>
+            <w:pPr>
+              <w:jc w:val="center"/>
+            </w:pPr>
+            <w:r>
+              <w:t>P10</w:t>
+            </w:r>
+          </w:p>
+        </w:tc>
+        <w:tc>
+          <w:tcPr>
+            <w:tcW w:type="dxa" w:w="1728"/>
+          </w:tcPr>
+          <w:p>
+            <w:pPr>
+              <w:jc w:val="center"/>
+            </w:pPr>
+            <w:r>
+              <w:t>18.0</w:t>
+            </w:r>
+          </w:p>
+        </w:tc>
+        <w:tc>
+          <w:tcPr>
+            <w:tcW w:type="dxa" w:w="1728"/>
+          </w:tcPr>
+          <w:p>
+            <w:pPr>
+              <w:jc w:val="center"/>
+            </w:pPr>
+            <w:r>
+              <w:t>18.0</w:t>
+            </w:r>
+          </w:p>
+        </w:tc>
+        <w:tc>
+          <w:tcPr>
+            <w:tcW w:type="dxa" w:w="1728"/>
+          </w:tcPr>
+          <w:p>
+            <w:pPr>
+              <w:jc w:val="center"/>
+            </w:pPr>
+            <w:r>
+              <w:t>18.0</w:t>
+            </w:r>
+          </w:p>
+        </w:tc>
+        <w:tc>
+          <w:tcPr>
+            <w:tcW w:type="dxa" w:w="1728"/>
+          </w:tcPr>
+          <w:p>
+            <w:pPr>
+              <w:jc w:val="center"/>
+            </w:pPr>
+            <w:r>
+              <w:t>2.29</w:t>
+            </w:r>
+          </w:p>
+        </w:tc>
+      </w:tr>
+      <w:tr>
+        <w:tc>
+          <w:tcPr>
+            <w:tcW w:type="dxa" w:w="1728"/>
+          </w:tcPr>
+          <w:p>
+            <w:pPr>
+              <w:jc w:val="center"/>
+            </w:pPr>
+            <w:r>
+              <w:t>P11</w:t>
+            </w:r>
+          </w:p>
+        </w:tc>
+        <w:tc>
+          <w:tcPr>
+            <w:tcW w:type="dxa" w:w="1728"/>
+          </w:tcPr>
+          <w:p>
+            <w:pPr>
+              <w:jc w:val="center"/>
+            </w:pPr>
+            <w:r>
+              <w:t>4.0</w:t>
+            </w:r>
+          </w:p>
+        </w:tc>
+        <w:tc>
+          <w:tcPr>
+            <w:tcW w:type="dxa" w:w="1728"/>
+          </w:tcPr>
+          <w:p>
+            <w:pPr>
+              <w:jc w:val="center"/>
+            </w:pPr>
+            <w:r>
+              <w:t>4.0</w:t>
+            </w:r>
+          </w:p>
+        </w:tc>
+        <w:tc>
+          <w:tcPr>
+            <w:tcW w:type="dxa" w:w="1728"/>
+          </w:tcPr>
+          <w:p>
+            <w:pPr>
+              <w:jc w:val="center"/>
+            </w:pPr>
+            <w:r>
+              <w:t>4.0</w:t>
+            </w:r>
+          </w:p>
+        </w:tc>
+        <w:tc>
+          <w:tcPr>
+            <w:tcW w:type="dxa" w:w="1728"/>
+          </w:tcPr>
+          <w:p>
+            <w:pPr>
+              <w:jc w:val="center"/>
+            </w:pPr>
+            <w:r>
+              <w:t>0.51</w:t>
+            </w:r>
+          </w:p>
+        </w:tc>
+      </w:tr>
+    </w:tbl>
+    <w:p>
+      <w:r>
+        <w:t>Steady-state analysis completed for 10 junctions and 11 pipes. See compliance section for detailed checks.</w:t>
+      </w:r>
+    </w:p>
+    <w:p>
+      <w:r>
+        <w:br w:type="page"/>
+      </w:r>
+    </w:p>
+    <w:p>
+      <w:pPr>
+        <w:pStyle w:val="Heading1"/>
+      </w:pPr>
+      <w:r>
+        <w:t>3. Compliance Summary</w:t>
+      </w:r>
+    </w:p>
+    <w:p>
+      <w:r>
+        <w:t>The following compliance checks have been performed against Australian standards (WSAA Guidelines).</w:t>
+      </w:r>
+    </w:p>
+    <w:tbl>
+      <w:tblPr>
+        <w:tblStyle w:val="LightGrid-Accent1"/>
+        <w:tblW w:type="auto" w:w="0"/>
+        <w:jc w:val="center"/>
+        <w:tblLook w:firstColumn="1" w:firstRow="1" w:lastColumn="0" w:lastRow="0" w:noHBand="0" w:noVBand="1" w:val="04A0"/>
+      </w:tblPr>
+      <w:tblGrid>
+        <w:gridCol w:w="2880"/>
+        <w:gridCol w:w="2880"/>
+        <w:gridCol w:w="2880"/>
+      </w:tblGrid>
+      <w:tr>
+        <w:tc>
+          <w:tcPr>
+            <w:tcW w:type="dxa" w:w="2880"/>
+            <w:shd w:fill="2E4057" w:val="clear"/>
+          </w:tcPr>
+          <w:p>
+            <w:pPr>
+              <w:jc w:val="center"/>
+            </w:pPr>
+            <w:r>
+              <w:rPr>
+                <w:b/>
+                <w:color w:val="FFFFFF"/>
+              </w:rPr>
+              <w:t>Status</w:t>
+            </w:r>
+          </w:p>
+        </w:tc>
+        <w:tc>
+          <w:tcPr>
+            <w:tcW w:type="dxa" w:w="2880"/>
+            <w:shd w:fill="2E4057" w:val="clear"/>
+          </w:tcPr>
+          <w:p>
+            <w:pPr>
+              <w:jc w:val="center"/>
+            </w:pPr>
+            <w:r>
+              <w:rPr>
+                <w:b/>
+                <w:color w:val="FFFFFF"/>
+              </w:rPr>
+              <w:t>Element</w:t>
+            </w:r>
+          </w:p>
+        </w:tc>
+        <w:tc>
+          <w:tcPr>
+            <w:tcW w:type="dxa" w:w="2880"/>
+            <w:shd w:fill="2E4057" w:val="clear"/>
+          </w:tcPr>
+          <w:p>
+            <w:pPr>
+              <w:jc w:val="center"/>
+            </w:pPr>
+            <w:r>
+              <w:rPr>
+                <w:b/>
+                <w:color w:val="FFFFFF"/>
+              </w:rPr>
+              <w:t>Message</w:t>
+            </w:r>
+          </w:p>
+        </w:tc>
+      </w:tr>
+      <w:tr>
+        <w:tc>
+          <w:tcPr>
+            <w:tcW w:type="dxa" w:w="2880"/>
+          </w:tcPr>
+          <w:p>
+            <w:pPr>
+              <w:jc w:val="center"/>
+            </w:pPr>
+            <w:r>
+              <w:rPr>
+                <w:b/>
+                <w:color w:val="CC7A00"/>
+              </w:rPr>
+              <w:t>WARNING</w:t>
+            </w:r>
+          </w:p>
+        </w:tc>
+        <w:tc>
+          <w:tcPr>
+            <w:tcW w:type="dxa" w:w="2880"/>
+          </w:tcPr>
+          <w:p>
+            <w:pPr>
+              <w:jc w:val="center"/>
+            </w:pPr>
+            <w:r>
+              <w:t>J9</w:t>
+            </w:r>
+          </w:p>
+        </w:tc>
+        <w:tc>
+          <w:tcPr>
+            <w:tcW w:type="dxa" w:w="2880"/>
+          </w:tcPr>
+          <w:p>
+            <w:pPr>
+              <w:jc w:val="center"/>
+            </w:pPr>
+            <w:r>
+              <w:t>Min pressure 16.1m &lt; 20m (WSAA minimum)</w:t>
+            </w:r>
+          </w:p>
+        </w:tc>
+      </w:tr>
+      <w:tr>
+        <w:tc>
+          <w:tcPr>
+            <w:tcW w:type="dxa" w:w="2880"/>
+          </w:tcPr>
+          <w:p>
+            <w:pPr>
+              <w:jc w:val="center"/>
+            </w:pPr>
+            <w:r>
+              <w:rPr>
+                <w:b/>
+                <w:color w:val="CC7A00"/>
+              </w:rPr>
+              <w:t>WARNING</w:t>
+            </w:r>
+          </w:p>
+        </w:tc>
+        <w:tc>
+          <w:tcPr>
+            <w:tcW w:type="dxa" w:w="2880"/>
+          </w:tcPr>
+          <w:p>
+            <w:pPr>
+              <w:jc w:val="center"/>
+            </w:pPr>
+            <w:r>
+              <w:t>J10</w:t>
+            </w:r>
+          </w:p>
+        </w:tc>
+        <w:tc>
+          <w:tcPr>
+            <w:tcW w:type="dxa" w:w="2880"/>
+          </w:tcPr>
+          <w:p>
+            <w:pPr>
+              <w:jc w:val="center"/>
+            </w:pPr>
+            <w:r>
+              <w:t>Min pressure 11.2m &lt; 20m (WSAA minimum)</w:t>
+            </w:r>
+          </w:p>
+        </w:tc>
+      </w:tr>
+      <w:tr>
+        <w:tc>
+          <w:tcPr>
+            <w:tcW w:type="dxa" w:w="2880"/>
+          </w:tcPr>
+          <w:p>
+            <w:pPr>
+              <w:jc w:val="center"/>
+            </w:pPr>
+            <w:r>
+              <w:rPr>
+                <w:b/>
+              </w:rPr>
+              <w:t>INFO</w:t>
+            </w:r>
+          </w:p>
+        </w:tc>
+        <w:tc>
+          <w:tcPr>
+            <w:tcW w:type="dxa" w:w="2880"/>
+          </w:tcPr>
+          <w:p>
+            <w:pPr>
+              <w:jc w:val="center"/>
+            </w:pPr>
+            <w:r>
+              <w:t>P4</w:t>
+            </w:r>
+          </w:p>
+        </w:tc>
+        <w:tc>
+          <w:tcPr>
+            <w:tcW w:type="dxa" w:w="2880"/>
+          </w:tcPr>
+          <w:p>
+            <w:pPr>
+              <w:jc w:val="center"/>
+            </w:pPr>
+            <w:r>
+              <w:t>Low velocity 0.23 m/s &lt; 0.6 m/s (sediment risk — WSAA)</w:t>
+            </w:r>
+          </w:p>
+        </w:tc>
+      </w:tr>
+      <w:tr>
+        <w:tc>
+          <w:tcPr>
+            <w:tcW w:type="dxa" w:w="2880"/>
+          </w:tcPr>
+          <w:p>
+            <w:pPr>
+              <w:jc w:val="center"/>
+            </w:pPr>
+            <w:r>
+              <w:rPr>
+                <w:b/>
+              </w:rPr>
+              <w:t>INFO</w:t>
+            </w:r>
+          </w:p>
+        </w:tc>
+        <w:tc>
+          <w:tcPr>
+            <w:tcW w:type="dxa" w:w="2880"/>
+          </w:tcPr>
+          <w:p>
+            <w:pPr>
+              <w:jc w:val="center"/>
+            </w:pPr>
+            <w:r>
+              <w:t>P5</w:t>
+            </w:r>
+          </w:p>
+        </w:tc>
+        <w:tc>
+          <w:tcPr>
+            <w:tcW w:type="dxa" w:w="2880"/>
+          </w:tcPr>
+          <w:p>
+            <w:pPr>
+              <w:jc w:val="center"/>
+            </w:pPr>
+            <w:r>
+              <w:t>Low velocity 0.23 m/s &lt; 0.6 m/s (sediment risk — WSAA)</w:t>
+            </w:r>
+          </w:p>
+        </w:tc>
+      </w:tr>
+      <w:tr>
+        <w:tc>
+          <w:tcPr>
+            <w:tcW w:type="dxa" w:w="2880"/>
+          </w:tcPr>
+          <w:p>
+            <w:pPr>
+              <w:jc w:val="center"/>
+            </w:pPr>
+            <w:r>
+              <w:rPr>
+                <w:b/>
+              </w:rPr>
+              <w:t>INFO</w:t>
+            </w:r>
+          </w:p>
+        </w:tc>
+        <w:tc>
+          <w:tcPr>
+            <w:tcW w:type="dxa" w:w="2880"/>
+          </w:tcPr>
+          <w:p>
+            <w:pPr>
+              <w:jc w:val="center"/>
+            </w:pPr>
+            <w:r>
+              <w:t>P6</w:t>
+            </w:r>
+          </w:p>
+        </w:tc>
+        <w:tc>
+          <w:tcPr>
+            <w:tcW w:type="dxa" w:w="2880"/>
+          </w:tcPr>
+          <w:p>
+            <w:pPr>
+              <w:jc w:val="center"/>
+            </w:pPr>
+            <w:r>
+              <w:t>Low velocity 0.22 m/s &lt; 0.6 m/s (sediment risk — WSAA)</w:t>
+            </w:r>
+          </w:p>
+        </w:tc>
+      </w:tr>
+      <w:tr>
+        <w:tc>
+          <w:tcPr>
+            <w:tcW w:type="dxa" w:w="2880"/>
+          </w:tcPr>
+          <w:p>
+            <w:pPr>
+              <w:jc w:val="center"/>
+            </w:pPr>
+            <w:r>
+              <w:rPr>
+                <w:b/>
+              </w:rPr>
+              <w:t>INFO</w:t>
+            </w:r>
+          </w:p>
+        </w:tc>
+        <w:tc>
+          <w:tcPr>
+            <w:tcW w:type="dxa" w:w="2880"/>
+          </w:tcPr>
+          <w:p>
+            <w:pPr>
+              <w:jc w:val="center"/>
+            </w:pPr>
+            <w:r>
+              <w:t>P7</w:t>
+            </w:r>
+          </w:p>
+        </w:tc>
+        <w:tc>
+          <w:tcPr>
+            <w:tcW w:type="dxa" w:w="2880"/>
+          </w:tcPr>
+          <w:p>
+            <w:pPr>
+              <w:jc w:val="center"/>
+            </w:pPr>
+            <w:r>
+              <w:t>Low velocity 0.39 m/s &lt; 0.6 m/s (sediment risk — WSAA)</w:t>
+            </w:r>
+          </w:p>
+        </w:tc>
+      </w:tr>
+      <w:tr>
+        <w:tc>
+          <w:tcPr>
+            <w:tcW w:type="dxa" w:w="2880"/>
+          </w:tcPr>
+          <w:p>
+            <w:pPr>
+              <w:jc w:val="center"/>
+            </w:pPr>
+            <w:r>
+              <w:rPr>
+                <w:b/>
+              </w:rPr>
+              <w:t>INFO</w:t>
+            </w:r>
+          </w:p>
+        </w:tc>
+        <w:tc>
+          <w:tcPr>
+            <w:tcW w:type="dxa" w:w="2880"/>
+          </w:tcPr>
+          <w:p>
+            <w:pPr>
+              <w:jc w:val="center"/>
+            </w:pPr>
+            <w:r>
+              <w:t>P8</w:t>
+            </w:r>
+          </w:p>
+        </w:tc>
+        <w:tc>
+          <w:tcPr>
+            <w:tcW w:type="dxa" w:w="2880"/>
+          </w:tcPr>
+          <w:p>
+            <w:pPr>
+              <w:jc w:val="center"/>
+            </w:pPr>
+            <w:r>
+              <w:t>Low velocity 0.38 m/s &lt; 0.6 m/s (sediment risk — WSAA)</w:t>
+            </w:r>
+          </w:p>
+        </w:tc>
+      </w:tr>
+      <w:tr>
+        <w:tc>
+          <w:tcPr>
+            <w:tcW w:type="dxa" w:w="2880"/>
+          </w:tcPr>
+          <w:p>
+            <w:pPr>
+              <w:jc w:val="center"/>
+            </w:pPr>
+            <w:r>
+              <w:rPr>
+                <w:b/>
+              </w:rPr>
+              <w:t>INFO</w:t>
+            </w:r>
+          </w:p>
+        </w:tc>
+        <w:tc>
+          <w:tcPr>
+            <w:tcW w:type="dxa" w:w="2880"/>
+          </w:tcPr>
+          <w:p>
+            <w:pPr>
+              <w:jc w:val="center"/>
+            </w:pPr>
+            <w:r>
+              <w:t>P9</w:t>
+            </w:r>
+          </w:p>
+        </w:tc>
+        <w:tc>
+          <w:tcPr>
+            <w:tcW w:type="dxa" w:w="2880"/>
+          </w:tcPr>
+          <w:p>
+            <w:pPr>
+              <w:jc w:val="center"/>
+            </w:pPr>
+            <w:r>
+              <w:t>Low velocity 0.47 m/s &lt; 0.6 m/s (sediment risk — WSAA)</w:t>
+            </w:r>
+          </w:p>
+        </w:tc>
+      </w:tr>
+      <w:tr>
+        <w:tc>
+          <w:tcPr>
+            <w:tcW w:type="dxa" w:w="2880"/>
+          </w:tcPr>
+          <w:p>
+            <w:pPr>
+              <w:jc w:val="center"/>
+            </w:pPr>
+            <w:r>
+              <w:rPr>
+                <w:b/>
+                <w:color w:val="CC7A00"/>
+              </w:rPr>
+              <w:t>WARNING</w:t>
+            </w:r>
+          </w:p>
+        </w:tc>
+        <w:tc>
+          <w:tcPr>
+            <w:tcW w:type="dxa" w:w="2880"/>
+          </w:tcPr>
+          <w:p>
+            <w:pPr>
+              <w:jc w:val="center"/>
+            </w:pPr>
+            <w:r>
+              <w:t>P10</w:t>
+            </w:r>
+          </w:p>
+        </w:tc>
+        <w:tc>
+          <w:tcPr>
+            <w:tcW w:type="dxa" w:w="2880"/>
+          </w:tcPr>
+          <w:p>
+            <w:pPr>
+              <w:jc w:val="center"/>
+            </w:pPr>
+            <w:r>
+              <w:t>Velocity 2.29 m/s &gt; 2.0 m/s limit</w:t>
+            </w:r>
+          </w:p>
+        </w:tc>
+      </w:tr>
+      <w:tr>
+        <w:tc>
+          <w:tcPr>
+            <w:tcW w:type="dxa" w:w="2880"/>
+          </w:tcPr>
+          <w:p>
+            <w:pPr>
+              <w:jc w:val="center"/>
+            </w:pPr>
+            <w:r>
+              <w:rPr>
+                <w:b/>
+              </w:rPr>
+              <w:t>INFO</w:t>
+            </w:r>
+          </w:p>
+        </w:tc>
+        <w:tc>
+          <w:tcPr>
+            <w:tcW w:type="dxa" w:w="2880"/>
+          </w:tcPr>
+          <w:p>
+            <w:pPr>
+              <w:jc w:val="center"/>
+            </w:pPr>
+            <w:r>
+              <w:t>P11</w:t>
+            </w:r>
+          </w:p>
+        </w:tc>
+        <w:tc>
+          <w:tcPr>
+            <w:tcW w:type="dxa" w:w="2880"/>
+          </w:tcPr>
+          <w:p>
+            <w:pPr>
+              <w:jc w:val="center"/>
+            </w:pPr>
+            <w:r>
+              <w:t>Low velocity 0.51 m/s &lt; 0.6 m/s (sediment risk — WSAA)</w:t>
+            </w:r>
+          </w:p>
+        </w:tc>
+      </w:tr>
+    </w:tbl>
+    <w:p>
+      <w:r>
+        <w:br w:type="page"/>
+      </w:r>
+    </w:p>
+    <w:p>
+      <w:pPr>
+        <w:pStyle w:val="Heading1"/>
+      </w:pPr>
+      <w:r>
         <w:t>Conclusions</w:t>
       </w:r>
     </w:p>
     <w:p>
       <w:r>
-        <w:t>Analysis complete. Review the detailed results in the preceding sections for engineering assessment.</w:t>
+        <w:t>3 warning(s) were identified. These should be reviewed and addressed where practicable to improve network performance.</w:t>
       </w:r>
     </w:p>
     <w:sectPr>

</xml_diff>